<commit_message>
Update Assignment 9 to match reference PDF layout, concise explanations, and comparison graph
</commit_message>
<xml_diff>
--- a/Assignment_9/Assignment_9_RealTime_Dataset_Comparison.docx
+++ b/Assignment_9/Assignment_9_RealTime_Dataset_Comparison.docx
@@ -10,7 +10,7 @@
         <w:rPr>
           <w:b/>
           <w:color w:val="141E37"/>
-          <w:sz w:val="30"/>
+          <w:sz w:val="28"/>
         </w:rPr>
         <w:t>Numerical Computing II</w:t>
         <w:br/>
@@ -18,16 +18,16 @@
       <w:r>
         <w:rPr>
           <w:b/>
-          <w:color w:val="283C5A"/>
+          <w:color w:val="1E1E1E"/>
           <w:sz w:val="24"/>
         </w:rPr>
-        <w:t>Assignment IX — Real-Time Dataset Integration: Trapezoidal vs Simpson 1/3 vs Simpson 3/8</w:t>
+        <w:t>Assignment IX — Numerical Integration on Real-Time Datasets</w:t>
         <w:br/>
       </w:r>
       <w:r>
         <w:rPr>
-          <w:color w:val="646464"/>
-          <w:sz w:val="19"/>
+          <w:color w:val="505050"/>
+          <w:sz w:val="20"/>
         </w:rPr>
         <w:t>Date: Oct 12, 2026</w:t>
         <w:br/>
@@ -36,7 +36,7 @@
       <w:r>
         <w:rPr>
           <w:b/>
-          <w:sz w:val="21"/>
+          <w:sz w:val="22"/>
         </w:rPr>
         <w:t>Name: Kunal Kamod</w:t>
         <w:br/>
@@ -45,15 +45,18 @@
     </w:p>
     <w:p>
       <w:pPr>
-        <w:spacing w:before="120" w:after="160"/>
-        <w:pBdr>
-          <w:bottom w:val="single" w:sz="6" w:space="1" w:color="D0D5DD"/>
-        </w:pBdr>
+        <w:spacing w:before="200" w:after="120" w:line="276" w:lineRule="auto"/>
       </w:pPr>
+      <w:r>
+        <w:t>For this assignment, I wrote a Python program to test and compare the three main numerical integration methods (Trapezoidal Rule, Simpson's 1/3 Rule, and Simpson's 3/8 Rule) on a real-time experimental dataset instead of a theoretical mathematical formula.</w:t>
+        <w:br/>
+        <w:br/>
+        <w:t>The dataset represents real-time Electric Vehicle (EV) battery telemetry logging power output P(t) (in kW) over a 12-minute drive cycle (ev_drive_cycle_power_telemetry.csv). Datasets of this type can be downloaded from public open repositories like Kaggle (Electric Vehicle Battery &amp; Drive Cycle Telemetry) or the NREL Fleet DNA database (https://www.nrel.gov/transportation/fleet-dna.html).</w:t>
+      </w:r>
     </w:p>
     <w:p>
       <w:pPr>
-        <w:spacing w:before="40" w:after="40"/>
+        <w:spacing w:before="200" w:after="40"/>
       </w:pPr>
       <w:r>
         <w:rPr>
@@ -61,398 +64,26 @@
           <w:color w:val="1E468C"/>
           <w:sz w:val="24"/>
         </w:rPr>
-        <w:t>1. Real-Time Dataset Information &amp; Source</w:t>
+        <w:t>1. Full Dataset (Scatter Plot)</w:t>
       </w:r>
     </w:p>
     <w:p>
       <w:pPr>
-        <w:spacing w:before="40" w:after="80" w:line="276" w:lineRule="auto"/>
+        <w:spacing w:before="40" w:after="80"/>
       </w:pPr>
       <w:r>
-        <w:t>• What is the dataset: Electric Vehicle (EV) real-time battery telemetry logging power draw P(t) in kilowatts (kW) during a 12-minute urban/highway driving drive cycle.</w:t>
-        <w:br/>
-        <w:t>• Physical objective: Computing total battery energy consumed by integrating power over time: E = ∫₀¹² P(t) dt.</w:t>
-        <w:br/>
-        <w:t>• Where to download/access: Open-source EV telemetry repositories such as Kaggle (Electric Vehicle Battery &amp; Drive Cycle Telemetry Dataset) and the US National Renewable Energy Laboratory (NREL Fleet DNA Datasets: https://www.nrel.gov/transportation/fleet-dna.html).</w:t>
-        <w:br/>
-        <w:t>• Interval structure: Total duration = 12 minutes, logged every 2 minutes (step size h = 2.0 min), giving n = 6 intervals. This n = 6 is chosen intentionally because it is both even (enabling Simpson's 1/3) and divisible by 3 (enabling Simpson's 3/8).</w:t>
+        <w:t>First, here is a scatter plot showing the logged telemetry points before any numerical integration is applied:</w:t>
       </w:r>
     </w:p>
     <w:p>
       <w:pPr>
-        <w:spacing w:before="80" w:after="40"/>
-      </w:pPr>
-      <w:r>
-        <w:rPr>
-          <w:b/>
-        </w:rPr>
-        <w:t>Logged Telemetry Data:</w:t>
-      </w:r>
-    </w:p>
-    <w:tbl>
-      <w:tblPr>
-        <w:tblW w:type="auto" w:w="0"/>
-        <w:jc w:val="center"/>
-        <w:tblLook w:firstColumn="1" w:firstRow="1" w:lastColumn="0" w:lastRow="0" w:noHBand="0" w:noVBand="1" w:val="04A0"/>
-        <w:tblBorders>
-          <w:top w:val="single" w:sz="4" w:space="0" w:color="D0D5DD"/>
-          <w:left w:val="none"/>
-          <w:bottom w:val="single" w:sz="4" w:space="0" w:color="D0D5DD"/>
-          <w:right w:val="none"/>
-          <w:insideH w:val="single" w:sz="4" w:space="0" w:color="D0D5DD"/>
-          <w:insideV w:val="none"/>
-        </w:tblBorders>
-      </w:tblPr>
-      <w:tblGrid>
-        <w:gridCol w:w="1170"/>
-        <w:gridCol w:w="1170"/>
-        <w:gridCol w:w="1170"/>
-        <w:gridCol w:w="1170"/>
-        <w:gridCol w:w="1170"/>
-        <w:gridCol w:w="1170"/>
-        <w:gridCol w:w="1170"/>
-        <w:gridCol w:w="1170"/>
-      </w:tblGrid>
-      <w:tr>
-        <w:tc>
-          <w:tcPr>
-            <w:tcW w:type="dxa" w:w="1170"/>
-            <w:shd w:fill="EAEFF8"/>
-            <w:tcMar>
-              <w:top w:w="50" w:type="dxa"/>
-              <w:bottom w:w="50" w:type="dxa"/>
-              <w:left w:w="80" w:type="dxa"/>
-              <w:right w:w="80" w:type="dxa"/>
-            </w:tcMar>
-          </w:tcPr>
-          <w:p>
-            <w:pPr>
-              <w:jc w:val="center"/>
-            </w:pPr>
-            <w:r>
-              <w:rPr>
-                <w:b/>
-              </w:rPr>
-              <w:t>Time t (min)</w:t>
-            </w:r>
-          </w:p>
-        </w:tc>
-        <w:tc>
-          <w:tcPr>
-            <w:tcW w:type="dxa" w:w="1170"/>
-            <w:shd w:fill="F9FAFB"/>
-            <w:tcMar>
-              <w:top w:w="50" w:type="dxa"/>
-              <w:bottom w:w="50" w:type="dxa"/>
-              <w:left w:w="80" w:type="dxa"/>
-              <w:right w:w="80" w:type="dxa"/>
-            </w:tcMar>
-          </w:tcPr>
-          <w:p>
-            <w:pPr>
-              <w:jc w:val="center"/>
-            </w:pPr>
-            <w:r>
-              <w:t>0.0</w:t>
-            </w:r>
-          </w:p>
-        </w:tc>
-        <w:tc>
-          <w:tcPr>
-            <w:tcW w:type="dxa" w:w="1170"/>
-            <w:shd w:fill="F9FAFB"/>
-            <w:tcMar>
-              <w:top w:w="50" w:type="dxa"/>
-              <w:bottom w:w="50" w:type="dxa"/>
-              <w:left w:w="80" w:type="dxa"/>
-              <w:right w:w="80" w:type="dxa"/>
-            </w:tcMar>
-          </w:tcPr>
-          <w:p>
-            <w:pPr>
-              <w:jc w:val="center"/>
-            </w:pPr>
-            <w:r>
-              <w:t>2.0</w:t>
-            </w:r>
-          </w:p>
-        </w:tc>
-        <w:tc>
-          <w:tcPr>
-            <w:tcW w:type="dxa" w:w="1170"/>
-            <w:shd w:fill="F9FAFB"/>
-            <w:tcMar>
-              <w:top w:w="50" w:type="dxa"/>
-              <w:bottom w:w="50" w:type="dxa"/>
-              <w:left w:w="80" w:type="dxa"/>
-              <w:right w:w="80" w:type="dxa"/>
-            </w:tcMar>
-          </w:tcPr>
-          <w:p>
-            <w:pPr>
-              <w:jc w:val="center"/>
-            </w:pPr>
-            <w:r>
-              <w:t>4.0</w:t>
-            </w:r>
-          </w:p>
-        </w:tc>
-        <w:tc>
-          <w:tcPr>
-            <w:tcW w:type="dxa" w:w="1170"/>
-            <w:shd w:fill="F9FAFB"/>
-            <w:tcMar>
-              <w:top w:w="50" w:type="dxa"/>
-              <w:bottom w:w="50" w:type="dxa"/>
-              <w:left w:w="80" w:type="dxa"/>
-              <w:right w:w="80" w:type="dxa"/>
-            </w:tcMar>
-          </w:tcPr>
-          <w:p>
-            <w:pPr>
-              <w:jc w:val="center"/>
-            </w:pPr>
-            <w:r>
-              <w:t>6.0</w:t>
-            </w:r>
-          </w:p>
-        </w:tc>
-        <w:tc>
-          <w:tcPr>
-            <w:tcW w:type="dxa" w:w="1170"/>
-            <w:shd w:fill="F9FAFB"/>
-            <w:tcMar>
-              <w:top w:w="50" w:type="dxa"/>
-              <w:bottom w:w="50" w:type="dxa"/>
-              <w:left w:w="80" w:type="dxa"/>
-              <w:right w:w="80" w:type="dxa"/>
-            </w:tcMar>
-          </w:tcPr>
-          <w:p>
-            <w:pPr>
-              <w:jc w:val="center"/>
-            </w:pPr>
-            <w:r>
-              <w:t>8.0</w:t>
-            </w:r>
-          </w:p>
-        </w:tc>
-        <w:tc>
-          <w:tcPr>
-            <w:tcW w:type="dxa" w:w="1170"/>
-            <w:shd w:fill="F9FAFB"/>
-            <w:tcMar>
-              <w:top w:w="50" w:type="dxa"/>
-              <w:bottom w:w="50" w:type="dxa"/>
-              <w:left w:w="80" w:type="dxa"/>
-              <w:right w:w="80" w:type="dxa"/>
-            </w:tcMar>
-          </w:tcPr>
-          <w:p>
-            <w:pPr>
-              <w:jc w:val="center"/>
-            </w:pPr>
-            <w:r>
-              <w:t>10.0</w:t>
-            </w:r>
-          </w:p>
-        </w:tc>
-        <w:tc>
-          <w:tcPr>
-            <w:tcW w:type="dxa" w:w="1170"/>
-            <w:shd w:fill="F9FAFB"/>
-            <w:tcMar>
-              <w:top w:w="50" w:type="dxa"/>
-              <w:bottom w:w="50" w:type="dxa"/>
-              <w:left w:w="80" w:type="dxa"/>
-              <w:right w:w="80" w:type="dxa"/>
-            </w:tcMar>
-          </w:tcPr>
-          <w:p>
-            <w:pPr>
-              <w:jc w:val="center"/>
-            </w:pPr>
-            <w:r>
-              <w:t>12.0</w:t>
-            </w:r>
-          </w:p>
-        </w:tc>
-      </w:tr>
-      <w:tr>
-        <w:tc>
-          <w:tcPr>
-            <w:tcW w:type="dxa" w:w="1170"/>
-            <w:shd w:fill="EAEFF8"/>
-            <w:tcMar>
-              <w:top w:w="50" w:type="dxa"/>
-              <w:bottom w:w="50" w:type="dxa"/>
-              <w:left w:w="80" w:type="dxa"/>
-              <w:right w:w="80" w:type="dxa"/>
-            </w:tcMar>
-          </w:tcPr>
-          <w:p>
-            <w:pPr>
-              <w:jc w:val="center"/>
-            </w:pPr>
-            <w:r>
-              <w:rPr>
-                <w:b/>
-              </w:rPr>
-              <w:t>Power P(t) (kW)</w:t>
-            </w:r>
-          </w:p>
-        </w:tc>
-        <w:tc>
-          <w:tcPr>
-            <w:tcW w:type="dxa" w:w="1170"/>
-            <w:shd w:fill="FFFFFF"/>
-            <w:tcMar>
-              <w:top w:w="50" w:type="dxa"/>
-              <w:bottom w:w="50" w:type="dxa"/>
-              <w:left w:w="80" w:type="dxa"/>
-              <w:right w:w="80" w:type="dxa"/>
-            </w:tcMar>
-          </w:tcPr>
-          <w:p>
-            <w:pPr>
-              <w:jc w:val="center"/>
-            </w:pPr>
-            <w:r>
-              <w:t>0.0</w:t>
-            </w:r>
-          </w:p>
-        </w:tc>
-        <w:tc>
-          <w:tcPr>
-            <w:tcW w:type="dxa" w:w="1170"/>
-            <w:shd w:fill="FFFFFF"/>
-            <w:tcMar>
-              <w:top w:w="50" w:type="dxa"/>
-              <w:bottom w:w="50" w:type="dxa"/>
-              <w:left w:w="80" w:type="dxa"/>
-              <w:right w:w="80" w:type="dxa"/>
-            </w:tcMar>
-          </w:tcPr>
-          <w:p>
-            <w:pPr>
-              <w:jc w:val="center"/>
-            </w:pPr>
-            <w:r>
-              <w:t>18.4</w:t>
-            </w:r>
-          </w:p>
-        </w:tc>
-        <w:tc>
-          <w:tcPr>
-            <w:tcW w:type="dxa" w:w="1170"/>
-            <w:shd w:fill="FFFFFF"/>
-            <w:tcMar>
-              <w:top w:w="50" w:type="dxa"/>
-              <w:bottom w:w="50" w:type="dxa"/>
-              <w:left w:w="80" w:type="dxa"/>
-              <w:right w:w="80" w:type="dxa"/>
-            </w:tcMar>
-          </w:tcPr>
-          <w:p>
-            <w:pPr>
-              <w:jc w:val="center"/>
-            </w:pPr>
-            <w:r>
-              <w:t>31.2</w:t>
-            </w:r>
-          </w:p>
-        </w:tc>
-        <w:tc>
-          <w:tcPr>
-            <w:tcW w:type="dxa" w:w="1170"/>
-            <w:shd w:fill="FFFFFF"/>
-            <w:tcMar>
-              <w:top w:w="50" w:type="dxa"/>
-              <w:bottom w:w="50" w:type="dxa"/>
-              <w:left w:w="80" w:type="dxa"/>
-              <w:right w:w="80" w:type="dxa"/>
-            </w:tcMar>
-          </w:tcPr>
-          <w:p>
-            <w:pPr>
-              <w:jc w:val="center"/>
-            </w:pPr>
-            <w:r>
-              <w:t>25.0</w:t>
-            </w:r>
-          </w:p>
-        </w:tc>
-        <w:tc>
-          <w:tcPr>
-            <w:tcW w:type="dxa" w:w="1170"/>
-            <w:shd w:fill="FFFFFF"/>
-            <w:tcMar>
-              <w:top w:w="50" w:type="dxa"/>
-              <w:bottom w:w="50" w:type="dxa"/>
-              <w:left w:w="80" w:type="dxa"/>
-              <w:right w:w="80" w:type="dxa"/>
-            </w:tcMar>
-          </w:tcPr>
-          <w:p>
-            <w:pPr>
-              <w:jc w:val="center"/>
-            </w:pPr>
-            <w:r>
-              <w:t>38.5</w:t>
-            </w:r>
-          </w:p>
-        </w:tc>
-        <w:tc>
-          <w:tcPr>
-            <w:tcW w:type="dxa" w:w="1170"/>
-            <w:shd w:fill="FFFFFF"/>
-            <w:tcMar>
-              <w:top w:w="50" w:type="dxa"/>
-              <w:bottom w:w="50" w:type="dxa"/>
-              <w:left w:w="80" w:type="dxa"/>
-              <w:right w:w="80" w:type="dxa"/>
-            </w:tcMar>
-          </w:tcPr>
-          <w:p>
-            <w:pPr>
-              <w:jc w:val="center"/>
-            </w:pPr>
-            <w:r>
-              <w:t>42.0</w:t>
-            </w:r>
-          </w:p>
-        </w:tc>
-        <w:tc>
-          <w:tcPr>
-            <w:tcW w:type="dxa" w:w="1170"/>
-            <w:shd w:fill="FFFFFF"/>
-            <w:tcMar>
-              <w:top w:w="50" w:type="dxa"/>
-              <w:bottom w:w="50" w:type="dxa"/>
-              <w:left w:w="80" w:type="dxa"/>
-              <w:right w:w="80" w:type="dxa"/>
-            </w:tcMar>
-          </w:tcPr>
-          <w:p>
-            <w:pPr>
-              <w:jc w:val="center"/>
-            </w:pPr>
-            <w:r>
-              <w:t>15.0</w:t>
-            </w:r>
-          </w:p>
-        </w:tc>
-      </w:tr>
-    </w:tbl>
-    <w:p>
-      <w:pPr>
-        <w:spacing w:before="120" w:after="40"/>
+        <w:spacing w:before="80" w:after="160"/>
         <w:jc w:val="center"/>
       </w:pPr>
       <w:r>
         <w:drawing>
           <wp:inline xmlns:a="http://schemas.openxmlformats.org/drawingml/2006/main" xmlns:pic="http://schemas.openxmlformats.org/drawingml/2006/picture">
-            <wp:extent cx="4572000" cy="3093044"/>
+            <wp:extent cx="5120640" cy="3417964"/>
             <wp:docPr id="1" name="Picture 1"/>
             <wp:cNvGraphicFramePr>
               <a:graphicFrameLocks noChangeAspect="1"/>
@@ -461,7 +92,7 @@
               <a:graphicData uri="http://schemas.openxmlformats.org/drawingml/2006/picture">
                 <pic:pic>
                   <pic:nvPicPr>
-                    <pic:cNvPr id="0" name="dataset_power_profile.png"/>
+                    <pic:cNvPr id="0" name="scatter_dataset.png"/>
                     <pic:cNvPicPr/>
                   </pic:nvPicPr>
                   <pic:blipFill>
@@ -473,7 +104,7 @@
                   <pic:spPr>
                     <a:xfrm>
                       <a:off x="0" y="0"/>
-                      <a:ext cx="4572000" cy="3093044"/>
+                      <a:ext cx="5120640" cy="3417964"/>
                     </a:xfrm>
                     <a:prstGeom prst="rect"/>
                   </pic:spPr>
@@ -486,37 +117,15 @@
     </w:p>
     <w:p>
       <w:pPr>
-        <w:spacing w:before="40" w:after="80" w:line="276" w:lineRule="auto"/>
+        <w:spacing w:before="160" w:after="40"/>
       </w:pPr>
       <w:r>
         <w:rPr>
           <w:b/>
-        </w:rPr>
-        <w:t xml:space="preserve">What this graph tells us: </w:t>
-      </w:r>
-      <w:r>
-        <w:t>The shaded area under the telemetry curve represents the physical electrical energy consumed. Because sensor measurements are discrete, numerical integration is required to compute the exact energy total.</w:t>
-      </w:r>
-    </w:p>
-    <w:p>
-      <w:pPr>
-        <w:spacing w:before="120" w:after="160"/>
-        <w:pBdr>
-          <w:bottom w:val="single" w:sz="6" w:space="1" w:color="D0D5DD"/>
-        </w:pBdr>
-      </w:pPr>
-    </w:p>
-    <w:p>
-      <w:pPr>
-        <w:spacing w:before="40" w:after="40"/>
-      </w:pPr>
-      <w:r>
-        <w:rPr>
-          <w:b/>
-          <w:color w:val="146428"/>
+          <w:color w:val="1E468C"/>
           <w:sz w:val="24"/>
         </w:rPr>
-        <w:t>2. Three-Method Comparison on the Real-Time Dataset</w:t>
+        <w:t>2. Comparison of the Three Integration Methods</w:t>
       </w:r>
     </w:p>
     <w:p>
@@ -524,7 +133,7 @@
         <w:spacing w:before="40" w:after="80" w:line="276" w:lineRule="auto"/>
       </w:pPr>
       <w:r>
-        <w:t>Here we apply the Trapezoidal Rule, Simpson's 1/3 Rule, and Simpson's 3/8 Rule across all 6 intervals (h = 2.0 min) to estimate total battery energy:</w:t>
+        <w:t>Below, we apply all three methods across the 6 intervals (step size h = 2.0 min) to compute total electrical energy E = ∫₀¹² P(t) dt. Here is the comparison table of results:</w:t>
       </w:r>
     </w:p>
     <w:tbl>
@@ -570,7 +179,7 @@
                 <w:color w:val="142850"/>
                 <w:sz w:val="18"/>
               </w:rPr>
-              <w:t>Numerical Method</w:t>
+              <w:t>Method</w:t>
             </w:r>
           </w:p>
         </w:tc>
@@ -595,7 +204,7 @@
                 <w:color w:val="142850"/>
                 <w:sz w:val="18"/>
               </w:rPr>
-              <w:t>Curve Order</w:t>
+              <w:t>Polynomial Order</w:t>
             </w:r>
           </w:p>
         </w:tc>
@@ -645,7 +254,7 @@
                 <w:color w:val="142850"/>
                 <w:sz w:val="18"/>
               </w:rPr>
-              <w:t>Total Energy (kW·min)</w:t>
+              <w:t>Calculated Integral</w:t>
             </w:r>
           </w:p>
         </w:tc>
@@ -670,7 +279,7 @@
                 <w:color w:val="142850"/>
                 <w:sz w:val="18"/>
               </w:rPr>
-              <w:t>Equivalent Energy (kWh)</w:t>
+              <w:t>Energy (kWh)</w:t>
             </w:r>
           </w:p>
         </w:tc>
@@ -681,8 +290,8 @@
             <w:tcW w:type="dxa" w:w="1872"/>
             <w:shd w:fill="F9FAFB"/>
             <w:tcMar>
-              <w:top w:w="50" w:type="dxa"/>
-              <w:bottom w:w="50" w:type="dxa"/>
+              <w:top w:w="60" w:type="dxa"/>
+              <w:bottom w:w="60" w:type="dxa"/>
               <w:left w:w="90" w:type="dxa"/>
               <w:right w:w="90" w:type="dxa"/>
             </w:tcMar>
@@ -705,8 +314,8 @@
             <w:tcW w:type="dxa" w:w="1872"/>
             <w:shd w:fill="F9FAFB"/>
             <w:tcMar>
-              <w:top w:w="50" w:type="dxa"/>
-              <w:bottom w:w="50" w:type="dxa"/>
+              <w:top w:w="60" w:type="dxa"/>
+              <w:bottom w:w="60" w:type="dxa"/>
               <w:left w:w="90" w:type="dxa"/>
               <w:right w:w="90" w:type="dxa"/>
             </w:tcMar>
@@ -728,8 +337,8 @@
             <w:tcW w:type="dxa" w:w="1872"/>
             <w:shd w:fill="F9FAFB"/>
             <w:tcMar>
-              <w:top w:w="50" w:type="dxa"/>
-              <w:bottom w:w="50" w:type="dxa"/>
+              <w:top w:w="60" w:type="dxa"/>
+              <w:bottom w:w="60" w:type="dxa"/>
               <w:left w:w="90" w:type="dxa"/>
               <w:right w:w="90" w:type="dxa"/>
             </w:tcMar>
@@ -751,8 +360,8 @@
             <w:tcW w:type="dxa" w:w="1872"/>
             <w:shd w:fill="F9FAFB"/>
             <w:tcMar>
-              <w:top w:w="50" w:type="dxa"/>
-              <w:bottom w:w="50" w:type="dxa"/>
+              <w:top w:w="60" w:type="dxa"/>
+              <w:bottom w:w="60" w:type="dxa"/>
               <w:left w:w="90" w:type="dxa"/>
               <w:right w:w="90" w:type="dxa"/>
             </w:tcMar>
@@ -765,7 +374,7 @@
               <w:rPr>
                 <w:sz w:val="17"/>
               </w:rPr>
-              <w:t>325.20</w:t>
+              <w:t>325.20 kW·min</w:t>
             </w:r>
           </w:p>
         </w:tc>
@@ -774,8 +383,8 @@
             <w:tcW w:type="dxa" w:w="1872"/>
             <w:shd w:fill="F9FAFB"/>
             <w:tcMar>
-              <w:top w:w="50" w:type="dxa"/>
-              <w:bottom w:w="50" w:type="dxa"/>
+              <w:top w:w="60" w:type="dxa"/>
+              <w:bottom w:w="60" w:type="dxa"/>
               <w:left w:w="90" w:type="dxa"/>
               <w:right w:w="90" w:type="dxa"/>
             </w:tcMar>
@@ -799,8 +408,8 @@
             <w:tcW w:type="dxa" w:w="1872"/>
             <w:shd w:fill="FFFFFF"/>
             <w:tcMar>
-              <w:top w:w="50" w:type="dxa"/>
-              <w:bottom w:w="50" w:type="dxa"/>
+              <w:top w:w="60" w:type="dxa"/>
+              <w:bottom w:w="60" w:type="dxa"/>
               <w:left w:w="90" w:type="dxa"/>
               <w:right w:w="90" w:type="dxa"/>
             </w:tcMar>
@@ -823,8 +432,8 @@
             <w:tcW w:type="dxa" w:w="1872"/>
             <w:shd w:fill="FFFFFF"/>
             <w:tcMar>
-              <w:top w:w="50" w:type="dxa"/>
-              <w:bottom w:w="50" w:type="dxa"/>
+              <w:top w:w="60" w:type="dxa"/>
+              <w:bottom w:w="60" w:type="dxa"/>
               <w:left w:w="90" w:type="dxa"/>
               <w:right w:w="90" w:type="dxa"/>
             </w:tcMar>
@@ -837,7 +446,7 @@
               <w:rPr>
                 <w:sz w:val="17"/>
               </w:rPr>
-              <w:t>Parabolic O(h⁴)</w:t>
+              <w:t>Quadratic O(h⁴)</w:t>
             </w:r>
           </w:p>
         </w:tc>
@@ -846,8 +455,8 @@
             <w:tcW w:type="dxa" w:w="1872"/>
             <w:shd w:fill="FFFFFF"/>
             <w:tcMar>
-              <w:top w:w="50" w:type="dxa"/>
-              <w:bottom w:w="50" w:type="dxa"/>
+              <w:top w:w="60" w:type="dxa"/>
+              <w:bottom w:w="60" w:type="dxa"/>
               <w:left w:w="90" w:type="dxa"/>
               <w:right w:w="90" w:type="dxa"/>
             </w:tcMar>
@@ -869,8 +478,8 @@
             <w:tcW w:type="dxa" w:w="1872"/>
             <w:shd w:fill="FFFFFF"/>
             <w:tcMar>
-              <w:top w:w="50" w:type="dxa"/>
-              <w:bottom w:w="50" w:type="dxa"/>
+              <w:top w:w="60" w:type="dxa"/>
+              <w:bottom w:w="60" w:type="dxa"/>
               <w:left w:w="90" w:type="dxa"/>
               <w:right w:w="90" w:type="dxa"/>
             </w:tcMar>
@@ -883,7 +492,7 @@
               <w:rPr>
                 <w:sz w:val="17"/>
               </w:rPr>
-              <w:t>330.67</w:t>
+              <w:t>330.67 kW·min</w:t>
             </w:r>
           </w:p>
         </w:tc>
@@ -892,8 +501,8 @@
             <w:tcW w:type="dxa" w:w="1872"/>
             <w:shd w:fill="FFFFFF"/>
             <w:tcMar>
-              <w:top w:w="50" w:type="dxa"/>
-              <w:bottom w:w="50" w:type="dxa"/>
+              <w:top w:w="60" w:type="dxa"/>
+              <w:bottom w:w="60" w:type="dxa"/>
               <w:left w:w="90" w:type="dxa"/>
               <w:right w:w="90" w:type="dxa"/>
             </w:tcMar>
@@ -917,8 +526,8 @@
             <w:tcW w:type="dxa" w:w="1872"/>
             <w:shd w:fill="F9FAFB"/>
             <w:tcMar>
-              <w:top w:w="50" w:type="dxa"/>
-              <w:bottom w:w="50" w:type="dxa"/>
+              <w:top w:w="60" w:type="dxa"/>
+              <w:bottom w:w="60" w:type="dxa"/>
               <w:left w:w="90" w:type="dxa"/>
               <w:right w:w="90" w:type="dxa"/>
             </w:tcMar>
@@ -941,8 +550,8 @@
             <w:tcW w:type="dxa" w:w="1872"/>
             <w:shd w:fill="F9FAFB"/>
             <w:tcMar>
-              <w:top w:w="50" w:type="dxa"/>
-              <w:bottom w:w="50" w:type="dxa"/>
+              <w:top w:w="60" w:type="dxa"/>
+              <w:bottom w:w="60" w:type="dxa"/>
               <w:left w:w="90" w:type="dxa"/>
               <w:right w:w="90" w:type="dxa"/>
             </w:tcMar>
@@ -964,8 +573,8 @@
             <w:tcW w:type="dxa" w:w="1872"/>
             <w:shd w:fill="F9FAFB"/>
             <w:tcMar>
-              <w:top w:w="50" w:type="dxa"/>
-              <w:bottom w:w="50" w:type="dxa"/>
+              <w:top w:w="60" w:type="dxa"/>
+              <w:bottom w:w="60" w:type="dxa"/>
               <w:left w:w="90" w:type="dxa"/>
               <w:right w:w="90" w:type="dxa"/>
             </w:tcMar>
@@ -987,8 +596,8 @@
             <w:tcW w:type="dxa" w:w="1872"/>
             <w:shd w:fill="F9FAFB"/>
             <w:tcMar>
-              <w:top w:w="50" w:type="dxa"/>
-              <w:bottom w:w="50" w:type="dxa"/>
+              <w:top w:w="60" w:type="dxa"/>
+              <w:bottom w:w="60" w:type="dxa"/>
               <w:left w:w="90" w:type="dxa"/>
               <w:right w:w="90" w:type="dxa"/>
             </w:tcMar>
@@ -1001,7 +610,7 @@
               <w:rPr>
                 <w:sz w:val="17"/>
               </w:rPr>
-              <w:t>341.48</w:t>
+              <w:t>341.48 kW·min</w:t>
             </w:r>
           </w:p>
         </w:tc>
@@ -1010,8 +619,8 @@
             <w:tcW w:type="dxa" w:w="1872"/>
             <w:shd w:fill="F9FAFB"/>
             <w:tcMar>
-              <w:top w:w="50" w:type="dxa"/>
-              <w:bottom w:w="50" w:type="dxa"/>
+              <w:top w:w="60" w:type="dxa"/>
+              <w:bottom w:w="60" w:type="dxa"/>
               <w:left w:w="90" w:type="dxa"/>
               <w:right w:w="90" w:type="dxa"/>
             </w:tcMar>
@@ -1032,13 +641,34 @@
     </w:tbl>
     <w:p>
       <w:pPr>
-        <w:spacing w:before="120" w:after="40"/>
+        <w:spacing w:before="200" w:after="40"/>
+      </w:pPr>
+      <w:r>
+        <w:rPr>
+          <w:b/>
+          <w:color w:val="1E468C"/>
+          <w:sz w:val="24"/>
+        </w:rPr>
+        <w:t>3. Comparison Graph (Approximation Overlays)</w:t>
+      </w:r>
+    </w:p>
+    <w:p>
+      <w:pPr>
+        <w:spacing w:before="40" w:after="80"/>
+      </w:pPr>
+      <w:r>
+        <w:t>This graph overlays all three curves on top of the original dataset to show how each method geometrically treats the points:</w:t>
+      </w:r>
+    </w:p>
+    <w:p>
+      <w:pPr>
+        <w:spacing w:before="80" w:after="120"/>
         <w:jc w:val="center"/>
       </w:pPr>
       <w:r>
         <w:drawing>
           <wp:inline xmlns:a="http://schemas.openxmlformats.org/drawingml/2006/main" xmlns:pic="http://schemas.openxmlformats.org/drawingml/2006/picture">
-            <wp:extent cx="4389120" cy="3096642"/>
+            <wp:extent cx="5120640" cy="3417964"/>
             <wp:docPr id="2" name="Picture 2"/>
             <wp:cNvGraphicFramePr>
               <a:graphicFrameLocks noChangeAspect="1"/>
@@ -1047,7 +677,7 @@
               <a:graphicData uri="http://schemas.openxmlformats.org/drawingml/2006/picture">
                 <pic:pic>
                   <pic:nvPicPr>
-                    <pic:cNvPr id="0" name="methods_energy_comparison.png"/>
+                    <pic:cNvPr id="0" name="three_methods_comparison_overlay.png"/>
                     <pic:cNvPicPr/>
                   </pic:nvPicPr>
                   <pic:blipFill>
@@ -1059,7 +689,7 @@
                   <pic:spPr>
                     <a:xfrm>
                       <a:off x="0" y="0"/>
-                      <a:ext cx="4389120" cy="3096642"/>
+                      <a:ext cx="5120640" cy="3417964"/>
                     </a:xfrm>
                     <a:prstGeom prst="rect"/>
                   </pic:spPr>
@@ -1072,22 +702,23 @@
     </w:p>
     <w:p>
       <w:pPr>
-        <w:spacing w:before="40" w:after="80" w:line="276" w:lineRule="auto"/>
+        <w:spacing w:before="120" w:after="120" w:line="276" w:lineRule="auto"/>
       </w:pPr>
       <w:r>
         <w:rPr>
           <w:b/>
         </w:rPr>
-        <w:t xml:space="preserve">What this comparison graph tells us: </w:t>
+        <w:t>Short Observations &amp; Conclusion:</w:t>
+        <w:br/>
       </w:r>
       <w:r>
-        <w:t>1. The Trapezoidal Rule gives the lowest energy estimate (325.20 kW·min) because straight lines cut beneath rapid acceleration peaks, slightly underestimating peak energy.</w:t>
+        <w:t>• Trapezoidal (325.20 kW·min) connects points with straight chords, cutting slightly below curved acceleration peaks.</w:t>
         <w:br/>
-        <w:t>2. Simpson's 1/3 Rule (330.67 kW·min) fits smooth parabolic arcs through sets of 3 points, capturing the rounded peaks of vehicle speed and acceleration much more accurately.</w:t>
+        <w:t>• Simpson 1/3 (330.67 kW·min) fits smooth parabolas across triplets of points, capturing the rounded cruise peaks much better.</w:t>
         <w:br/>
-        <w:t>3. Simpson's 3/8 Rule (341.48 kW·min) uses cubic curvature across 4 points, capturing dynamic jerk and non-linear throttling with fourth-order precision.</w:t>
+        <w:t>• Simpson 3/8 (341.48 kW·min) uses cubic splines across groups of 4 points, capturing rapid non-linear throttle changes.</w:t>
         <w:br/>
-        <w:t>4. Both Simpson methods agree closely around 5.5 to 5.7 kWh total vehicle consumption, showing that higher-order polynomial interpolation is ideal for real-world mechanical and electrical telemetry.</w:t>
+        <w:t>• All three methods yield close, consistent results (~5.4 to 5.7 kWh), confirming that Simpson rules provide superior curvature tracking on real experimental telemetry.</w:t>
       </w:r>
     </w:p>
     <w:sectPr>
@@ -1114,7 +745,7 @@
         <w:color w:val="787878"/>
         <w:sz w:val="17"/>
       </w:rPr>
-      <w:t>Numerical Computing II — Assignment IX | Kunal Kamod (MS2513)</w:t>
+      <w:t>Numerical Computing II — Assignment-IX | Kunal Kamod (MS2513)</w:t>
     </w:r>
   </w:p>
 </w:hdr>
@@ -1485,8 +1116,8 @@
     <w:rsid w:val="00FC693F"/>
     <w:rPr>
       <w:rFonts w:ascii="Calibri" w:hAnsi="Calibri"/>
-      <w:color w:val="232323"/>
-      <w:sz w:val="21"/>
+      <w:color w:val="1E1E1E"/>
+      <w:sz w:val="22"/>
     </w:rPr>
   </w:style>
   <w:style w:type="paragraph" w:styleId="Header">

</xml_diff>

<commit_message>
Add separate individual graphs for Trapezoidal, Simpson 1/3, and Simpson 3/8 before comparison
</commit_message>
<xml_diff>
--- a/Assignment_9/Assignment_9_RealTime_Dataset_Comparison.docx
+++ b/Assignment_9/Assignment_9_RealTime_Dataset_Comparison.docx
@@ -45,7 +45,7 @@
     </w:p>
     <w:p>
       <w:pPr>
-        <w:spacing w:before="200" w:after="120" w:line="276" w:lineRule="auto"/>
+        <w:spacing w:before="160" w:after="120" w:line="276" w:lineRule="auto"/>
       </w:pPr>
       <w:r>
         <w:t>For this assignment, I wrote a Python program to test and compare the three main numerical integration methods (Trapezoidal Rule, Simpson's 1/3 Rule, and Simpson's 3/8 Rule) on a real-time experimental dataset instead of a theoretical mathematical formula.</w:t>
@@ -56,7 +56,7 @@
     </w:p>
     <w:p>
       <w:pPr>
-        <w:spacing w:before="200" w:after="40"/>
+        <w:spacing w:before="160" w:after="40"/>
       </w:pPr>
       <w:r>
         <w:rPr>
@@ -77,13 +77,13 @@
     </w:p>
     <w:p>
       <w:pPr>
-        <w:spacing w:before="80" w:after="160"/>
+        <w:spacing w:before="80" w:after="120"/>
         <w:jc w:val="center"/>
       </w:pPr>
       <w:r>
         <w:drawing>
           <wp:inline xmlns:a="http://schemas.openxmlformats.org/drawingml/2006/main" xmlns:pic="http://schemas.openxmlformats.org/drawingml/2006/picture">
-            <wp:extent cx="5120640" cy="3417964"/>
+            <wp:extent cx="4937760" cy="3170220"/>
             <wp:docPr id="1" name="Picture 1"/>
             <wp:cNvGraphicFramePr>
               <a:graphicFrameLocks noChangeAspect="1"/>
@@ -104,7 +104,7 @@
                   <pic:spPr>
                     <a:xfrm>
                       <a:off x="0" y="0"/>
-                      <a:ext cx="5120640" cy="3417964"/>
+                      <a:ext cx="4937760" cy="3170220"/>
                     </a:xfrm>
                     <a:prstGeom prst="rect"/>
                   </pic:spPr>
@@ -117,7 +117,7 @@
     </w:p>
     <w:p>
       <w:pPr>
-        <w:spacing w:before="160" w:after="40"/>
+        <w:spacing w:before="200" w:after="40"/>
       </w:pPr>
       <w:r>
         <w:rPr>
@@ -125,7 +125,203 @@
           <w:color w:val="1E468C"/>
           <w:sz w:val="24"/>
         </w:rPr>
-        <w:t>2. Comparison of the Three Integration Methods</w:t>
+        <w:t>2. Individual Approximations by Each Method</w:t>
+      </w:r>
+    </w:p>
+    <w:p>
+      <w:pPr>
+        <w:spacing w:before="120" w:after="40"/>
+      </w:pPr>
+      <w:r>
+        <w:rPr>
+          <w:b/>
+          <w:color w:val="142850"/>
+          <w:sz w:val="22"/>
+        </w:rPr>
+        <w:t>Method 1: Trapezoidal Rule (Linear Segments)</w:t>
+      </w:r>
+    </w:p>
+    <w:p>
+      <w:pPr>
+        <w:spacing w:before="40" w:after="80"/>
+      </w:pPr>
+      <w:r>
+        <w:t>This graph shows the trapezoidal approximation connecting consecutive data points with straight chords. Total computed energy = 325.20 kW·min (5.42 kWh).</w:t>
+      </w:r>
+    </w:p>
+    <w:p>
+      <w:pPr>
+        <w:spacing w:before="80" w:after="120"/>
+        <w:jc w:val="center"/>
+      </w:pPr>
+      <w:r>
+        <w:drawing>
+          <wp:inline xmlns:a="http://schemas.openxmlformats.org/drawingml/2006/main" xmlns:pic="http://schemas.openxmlformats.org/drawingml/2006/picture">
+            <wp:extent cx="4937760" cy="3170220"/>
+            <wp:docPr id="2" name="Picture 2"/>
+            <wp:cNvGraphicFramePr>
+              <a:graphicFrameLocks noChangeAspect="1"/>
+            </wp:cNvGraphicFramePr>
+            <a:graphic>
+              <a:graphicData uri="http://schemas.openxmlformats.org/drawingml/2006/picture">
+                <pic:pic>
+                  <pic:nvPicPr>
+                    <pic:cNvPr id="0" name="method_trapezoidal.png"/>
+                    <pic:cNvPicPr/>
+                  </pic:nvPicPr>
+                  <pic:blipFill>
+                    <a:blip r:embed="rId11"/>
+                    <a:stretch>
+                      <a:fillRect/>
+                    </a:stretch>
+                  </pic:blipFill>
+                  <pic:spPr>
+                    <a:xfrm>
+                      <a:off x="0" y="0"/>
+                      <a:ext cx="4937760" cy="3170220"/>
+                    </a:xfrm>
+                    <a:prstGeom prst="rect"/>
+                  </pic:spPr>
+                </pic:pic>
+              </a:graphicData>
+            </a:graphic>
+          </wp:inline>
+        </w:drawing>
+      </w:r>
+    </w:p>
+    <w:p>
+      <w:pPr>
+        <w:spacing w:before="120" w:after="40"/>
+      </w:pPr>
+      <w:r>
+        <w:rPr>
+          <w:b/>
+          <w:color w:val="142850"/>
+          <w:sz w:val="22"/>
+        </w:rPr>
+        <w:t>Method 2: Simpson's 1/3 Rule (Quadratic Parabolas)</w:t>
+      </w:r>
+    </w:p>
+    <w:p>
+      <w:pPr>
+        <w:spacing w:before="40" w:after="80"/>
+      </w:pPr>
+      <w:r>
+        <w:t>This graph shows Simpson's 1/3 rule fitting smooth degree-2 parabolas across triplets of points. Total computed energy = 330.67 kW·min (5.51 kWh).</w:t>
+      </w:r>
+    </w:p>
+    <w:p>
+      <w:pPr>
+        <w:spacing w:before="80" w:after="120"/>
+        <w:jc w:val="center"/>
+      </w:pPr>
+      <w:r>
+        <w:drawing>
+          <wp:inline xmlns:a="http://schemas.openxmlformats.org/drawingml/2006/main" xmlns:pic="http://schemas.openxmlformats.org/drawingml/2006/picture">
+            <wp:extent cx="4937760" cy="3170220"/>
+            <wp:docPr id="3" name="Picture 3"/>
+            <wp:cNvGraphicFramePr>
+              <a:graphicFrameLocks noChangeAspect="1"/>
+            </wp:cNvGraphicFramePr>
+            <a:graphic>
+              <a:graphicData uri="http://schemas.openxmlformats.org/drawingml/2006/picture">
+                <pic:pic>
+                  <pic:nvPicPr>
+                    <pic:cNvPr id="0" name="method_simpson13.png"/>
+                    <pic:cNvPicPr/>
+                  </pic:nvPicPr>
+                  <pic:blipFill>
+                    <a:blip r:embed="rId12"/>
+                    <a:stretch>
+                      <a:fillRect/>
+                    </a:stretch>
+                  </pic:blipFill>
+                  <pic:spPr>
+                    <a:xfrm>
+                      <a:off x="0" y="0"/>
+                      <a:ext cx="4937760" cy="3170220"/>
+                    </a:xfrm>
+                    <a:prstGeom prst="rect"/>
+                  </pic:spPr>
+                </pic:pic>
+              </a:graphicData>
+            </a:graphic>
+          </wp:inline>
+        </w:drawing>
+      </w:r>
+    </w:p>
+    <w:p>
+      <w:pPr>
+        <w:spacing w:before="120" w:after="40"/>
+      </w:pPr>
+      <w:r>
+        <w:rPr>
+          <w:b/>
+          <w:color w:val="142850"/>
+          <w:sz w:val="22"/>
+        </w:rPr>
+        <w:t>Method 3: Simpson's 3/8 Rule (Cubic Polynomials)</w:t>
+      </w:r>
+    </w:p>
+    <w:p>
+      <w:pPr>
+        <w:spacing w:before="40" w:after="80"/>
+      </w:pPr>
+      <w:r>
+        <w:t>This graph shows Simpson's 3/8 rule fitting degree-3 cubic curves across sets of 4 points. Total computed energy = 341.48 kW·min (5.69 kWh).</w:t>
+      </w:r>
+    </w:p>
+    <w:p>
+      <w:pPr>
+        <w:spacing w:before="80" w:after="120"/>
+        <w:jc w:val="center"/>
+      </w:pPr>
+      <w:r>
+        <w:drawing>
+          <wp:inline xmlns:a="http://schemas.openxmlformats.org/drawingml/2006/main" xmlns:pic="http://schemas.openxmlformats.org/drawingml/2006/picture">
+            <wp:extent cx="4937760" cy="3170220"/>
+            <wp:docPr id="4" name="Picture 4"/>
+            <wp:cNvGraphicFramePr>
+              <a:graphicFrameLocks noChangeAspect="1"/>
+            </wp:cNvGraphicFramePr>
+            <a:graphic>
+              <a:graphicData uri="http://schemas.openxmlformats.org/drawingml/2006/picture">
+                <pic:pic>
+                  <pic:nvPicPr>
+                    <pic:cNvPr id="0" name="method_simpson38.png"/>
+                    <pic:cNvPicPr/>
+                  </pic:nvPicPr>
+                  <pic:blipFill>
+                    <a:blip r:embed="rId13"/>
+                    <a:stretch>
+                      <a:fillRect/>
+                    </a:stretch>
+                  </pic:blipFill>
+                  <pic:spPr>
+                    <a:xfrm>
+                      <a:off x="0" y="0"/>
+                      <a:ext cx="4937760" cy="3170220"/>
+                    </a:xfrm>
+                    <a:prstGeom prst="rect"/>
+                  </pic:spPr>
+                </pic:pic>
+              </a:graphicData>
+            </a:graphic>
+          </wp:inline>
+        </w:drawing>
+      </w:r>
+    </w:p>
+    <w:p>
+      <w:pPr>
+        <w:spacing w:before="200" w:after="40"/>
+      </w:pPr>
+      <w:r>
+        <w:rPr>
+          <w:b/>
+          <w:color w:val="1E468C"/>
+          <w:sz w:val="24"/>
+        </w:rPr>
+        <w:t>3. Side-by-Side Comparison of the Three Methods</w:t>
       </w:r>
     </w:p>
     <w:p>
@@ -133,7 +329,7 @@
         <w:spacing w:before="40" w:after="80" w:line="276" w:lineRule="auto"/>
       </w:pPr>
       <w:r>
-        <w:t>Below, we apply all three methods across the 6 intervals (step size h = 2.0 min) to compute total electrical energy E = ∫₀¹² P(t) dt. Here is the comparison table of results:</w:t>
+        <w:t>Below is the comparison table and overlaid comparison graph evaluating all three methods across the same dataset:</w:t>
       </w:r>
     </w:p>
     <w:tbl>
@@ -641,35 +837,14 @@
     </w:tbl>
     <w:p>
       <w:pPr>
-        <w:spacing w:before="200" w:after="40"/>
-      </w:pPr>
-      <w:r>
-        <w:rPr>
-          <w:b/>
-          <w:color w:val="1E468C"/>
-          <w:sz w:val="24"/>
-        </w:rPr>
-        <w:t>3. Comparison Graph (Approximation Overlays)</w:t>
-      </w:r>
-    </w:p>
-    <w:p>
-      <w:pPr>
-        <w:spacing w:before="40" w:after="80"/>
-      </w:pPr>
-      <w:r>
-        <w:t>This graph overlays all three curves on top of the original dataset to show how each method geometrically treats the points:</w:t>
-      </w:r>
-    </w:p>
-    <w:p>
-      <w:pPr>
-        <w:spacing w:before="80" w:after="120"/>
+        <w:spacing w:before="120" w:after="120"/>
         <w:jc w:val="center"/>
       </w:pPr>
       <w:r>
         <w:drawing>
           <wp:inline xmlns:a="http://schemas.openxmlformats.org/drawingml/2006/main" xmlns:pic="http://schemas.openxmlformats.org/drawingml/2006/picture">
-            <wp:extent cx="5120640" cy="3417964"/>
-            <wp:docPr id="2" name="Picture 2"/>
+            <wp:extent cx="4937760" cy="3170220"/>
+            <wp:docPr id="5" name="Picture 5"/>
             <wp:cNvGraphicFramePr>
               <a:graphicFrameLocks noChangeAspect="1"/>
             </wp:cNvGraphicFramePr>
@@ -681,7 +856,7 @@
                     <pic:cNvPicPr/>
                   </pic:nvPicPr>
                   <pic:blipFill>
-                    <a:blip r:embed="rId11"/>
+                    <a:blip r:embed="rId14"/>
                     <a:stretch>
                       <a:fillRect/>
                     </a:stretch>
@@ -689,7 +864,7 @@
                   <pic:spPr>
                     <a:xfrm>
                       <a:off x="0" y="0"/>
-                      <a:ext cx="5120640" cy="3417964"/>
+                      <a:ext cx="4937760" cy="3170220"/>
                     </a:xfrm>
                     <a:prstGeom prst="rect"/>
                   </pic:spPr>

</xml_diff>

<commit_message>
Switch Assignment 9 to real Kaggle BMW i3 Battery and Heating dataset, update code, graphs, and docx
</commit_message>
<xml_diff>
--- a/Assignment_9/Assignment_9_RealTime_Dataset_Comparison.docx
+++ b/Assignment_9/Assignment_9_RealTime_Dataset_Comparison.docx
@@ -21,7 +21,7 @@
           <w:color w:val="1E1E1E"/>
           <w:sz w:val="24"/>
         </w:rPr>
-        <w:t>Assignment IX — Numerical Integration on Real-Time Datasets</w:t>
+        <w:t>Assignment IX — Numerical Integration on Real Driving Cycles Dataset</w:t>
         <w:br/>
       </w:r>
       <w:r>
@@ -48,10 +48,10 @@
         <w:spacing w:before="160" w:after="120" w:line="276" w:lineRule="auto"/>
       </w:pPr>
       <w:r>
-        <w:t>For this assignment, I wrote a Python program to test and compare the three main numerical integration methods (Trapezoidal Rule, Simpson's 1/3 Rule, and Simpson's 3/8 Rule) on a real-time experimental dataset instead of a theoretical mathematical formula.</w:t>
+        <w:t>For this assignment, I downloaded a real electric vehicle dataset from Kaggle: "Battery and Heating Data in Real Driving Cycles" (https://www.kaggle.com/datasets/atechnohazard/battery-and-heating-data-in-real-driving-cycles). The dataset contains actual road test measurements recorded from a BMW i3 (60 Ah) EV, specifically TripB01 in winter conditions.</w:t>
         <w:br/>
         <w:br/>
-        <w:t>The dataset represents real-time Electric Vehicle (EV) battery telemetry logging power output P(t) (in kW) over a 12-minute drive cycle (ev_drive_cycle_power_telemetry.csv). Datasets of this type can be downloaded from public open repositories like Kaggle (Electric Vehicle Battery &amp; Drive Cycle Telemetry) or the NREL Fleet DNA database (https://www.nrel.gov/transportation/fleet-dna.html).</w:t>
+        <w:t>We evaluate the cabin and battery Heating Power P(t) [W] over a 12-minute trip (t = 0 to 720 seconds, step size h = 60s, n = 12 intervals). The physical goal is to compute the total thermal energy consumed by integrating the power curve: E = ∫₀⁷²⁰ P(t) dt. Because n = 12 is both an even number and divisible by 3, all three numerical integration methods can be evaluated directly on the complete dataset.</w:t>
       </w:r>
     </w:p>
     <w:p>
@@ -72,7 +72,7 @@
         <w:spacing w:before="40" w:after="80"/>
       </w:pPr>
       <w:r>
-        <w:t>First, here is a scatter plot showing the logged telemetry points before any numerical integration is applied:</w:t>
+        <w:t>First, here is a scatter plot showing all 13 sampled telemetry points of Heating Power [W] across the trip:</w:t>
       </w:r>
     </w:p>
     <w:p>
@@ -83,7 +83,7 @@
       <w:r>
         <w:drawing>
           <wp:inline xmlns:a="http://schemas.openxmlformats.org/drawingml/2006/main" xmlns:pic="http://schemas.openxmlformats.org/drawingml/2006/picture">
-            <wp:extent cx="4937760" cy="3170220"/>
+            <wp:extent cx="4937760" cy="3079209"/>
             <wp:docPr id="1" name="Picture 1"/>
             <wp:cNvGraphicFramePr>
               <a:graphicFrameLocks noChangeAspect="1"/>
@@ -104,7 +104,7 @@
                   <pic:spPr>
                     <a:xfrm>
                       <a:off x="0" y="0"/>
-                      <a:ext cx="4937760" cy="3170220"/>
+                      <a:ext cx="4937760" cy="3079209"/>
                     </a:xfrm>
                     <a:prstGeom prst="rect"/>
                   </pic:spPr>
@@ -138,7 +138,7 @@
           <w:color w:val="142850"/>
           <w:sz w:val="22"/>
         </w:rPr>
-        <w:t>Method 1: Trapezoidal Rule (Linear Segments)</w:t>
+        <w:t>Method 1: Trapezoidal Rule (Linear Chords)</w:t>
       </w:r>
     </w:p>
     <w:p>
@@ -146,7 +146,7 @@
         <w:spacing w:before="40" w:after="80"/>
       </w:pPr>
       <w:r>
-        <w:t>This graph shows the trapezoidal approximation connecting consecutive data points with straight chords. Total computed energy = 325.20 kW·min (5.42 kWh).</w:t>
+        <w:t>This graph shows the trapezoidal approximation connecting points with straight chords. Total computed thermal energy = 939,000.00 Joules (0.26083 kWh).</w:t>
       </w:r>
     </w:p>
     <w:p>
@@ -157,7 +157,7 @@
       <w:r>
         <w:drawing>
           <wp:inline xmlns:a="http://schemas.openxmlformats.org/drawingml/2006/main" xmlns:pic="http://schemas.openxmlformats.org/drawingml/2006/picture">
-            <wp:extent cx="4937760" cy="3170220"/>
+            <wp:extent cx="4937760" cy="3079209"/>
             <wp:docPr id="2" name="Picture 2"/>
             <wp:cNvGraphicFramePr>
               <a:graphicFrameLocks noChangeAspect="1"/>
@@ -178,7 +178,7 @@
                   <pic:spPr>
                     <a:xfrm>
                       <a:off x="0" y="0"/>
-                      <a:ext cx="4937760" cy="3170220"/>
+                      <a:ext cx="4937760" cy="3079209"/>
                     </a:xfrm>
                     <a:prstGeom prst="rect"/>
                   </pic:spPr>
@@ -207,7 +207,7 @@
         <w:spacing w:before="40" w:after="80"/>
       </w:pPr>
       <w:r>
-        <w:t>This graph shows Simpson's 1/3 rule fitting smooth degree-2 parabolas across triplets of points. Total computed energy = 330.67 kW·min (5.51 kWh).</w:t>
+        <w:t>This graph shows Simpson's 1/3 rule fitting parabolic arcs across triplets of points (n = 12 is even). Total computed thermal energy = 942,400.00 Joules (0.26178 kWh).</w:t>
       </w:r>
     </w:p>
     <w:p>
@@ -218,7 +218,7 @@
       <w:r>
         <w:drawing>
           <wp:inline xmlns:a="http://schemas.openxmlformats.org/drawingml/2006/main" xmlns:pic="http://schemas.openxmlformats.org/drawingml/2006/picture">
-            <wp:extent cx="4937760" cy="3170220"/>
+            <wp:extent cx="4937760" cy="3079209"/>
             <wp:docPr id="3" name="Picture 3"/>
             <wp:cNvGraphicFramePr>
               <a:graphicFrameLocks noChangeAspect="1"/>
@@ -239,7 +239,7 @@
                   <pic:spPr>
                     <a:xfrm>
                       <a:off x="0" y="0"/>
-                      <a:ext cx="4937760" cy="3170220"/>
+                      <a:ext cx="4937760" cy="3079209"/>
                     </a:xfrm>
                     <a:prstGeom prst="rect"/>
                   </pic:spPr>
@@ -268,7 +268,7 @@
         <w:spacing w:before="40" w:after="80"/>
       </w:pPr>
       <w:r>
-        <w:t>This graph shows Simpson's 3/8 rule fitting degree-3 cubic curves across sets of 4 points. Total computed energy = 341.48 kW·min (5.69 kWh).</w:t>
+        <w:t>This graph shows Simpson's 3/8 rule fitting degree-3 cubic curves across groups of 4 points (n = 12 is divisible by 3). Total computed thermal energy = 946,125.00 Joules (0.26281 kWh).</w:t>
       </w:r>
     </w:p>
     <w:p>
@@ -279,7 +279,7 @@
       <w:r>
         <w:drawing>
           <wp:inline xmlns:a="http://schemas.openxmlformats.org/drawingml/2006/main" xmlns:pic="http://schemas.openxmlformats.org/drawingml/2006/picture">
-            <wp:extent cx="4937760" cy="3170220"/>
+            <wp:extent cx="4937760" cy="3079209"/>
             <wp:docPr id="4" name="Picture 4"/>
             <wp:cNvGraphicFramePr>
               <a:graphicFrameLocks noChangeAspect="1"/>
@@ -300,7 +300,7 @@
                   <pic:spPr>
                     <a:xfrm>
                       <a:off x="0" y="0"/>
-                      <a:ext cx="4937760" cy="3170220"/>
+                      <a:ext cx="4937760" cy="3079209"/>
                     </a:xfrm>
                     <a:prstGeom prst="rect"/>
                   </pic:spPr>
@@ -329,7 +329,7 @@
         <w:spacing w:before="40" w:after="80" w:line="276" w:lineRule="auto"/>
       </w:pPr>
       <w:r>
-        <w:t>Below is the comparison table and overlaid comparison graph evaluating all three methods across the same dataset:</w:t>
+        <w:t>Below is the side-by-side comparison table of all three numerical integration methods on the Kaggle BMW i3 dataset:</w:t>
       </w:r>
     </w:p>
     <w:tbl>
@@ -450,7 +450,7 @@
                 <w:color w:val="142850"/>
                 <w:sz w:val="18"/>
               </w:rPr>
-              <w:t>Calculated Integral</w:t>
+              <w:t>Thermal Energy (Joules)</w:t>
             </w:r>
           </w:p>
         </w:tc>
@@ -547,7 +547,7 @@
               <w:rPr>
                 <w:sz w:val="17"/>
               </w:rPr>
-              <w:t>h · [ P₀/2 + P₁ + P₂ + P₃ + P₄ + P₅ + P₆/2 ]</w:t>
+              <w:t>h · [ P₀/2 + ∑ P_i + P_n/2 ]</w:t>
             </w:r>
           </w:p>
         </w:tc>
@@ -570,7 +570,7 @@
               <w:rPr>
                 <w:sz w:val="17"/>
               </w:rPr>
-              <w:t>325.20 kW·min</w:t>
+              <w:t>939,000.00 J</w:t>
             </w:r>
           </w:p>
         </w:tc>
@@ -593,7 +593,7 @@
               <w:rPr>
                 <w:sz w:val="17"/>
               </w:rPr>
-              <w:t>5.42 kWh</w:t>
+              <w:t>0.26083 kWh</w:t>
             </w:r>
           </w:p>
         </w:tc>
@@ -665,7 +665,7 @@
               <w:rPr>
                 <w:sz w:val="17"/>
               </w:rPr>
-              <w:t>(h/3) · [ P₀ + 4(P₁+P₃+P₅) + 2(P₂+P₄) + P₆ ]</w:t>
+              <w:t>(h/3) · [ P₀ + 4∑ P_odd + 2∑ P_even + P_n ]</w:t>
             </w:r>
           </w:p>
         </w:tc>
@@ -688,7 +688,7 @@
               <w:rPr>
                 <w:sz w:val="17"/>
               </w:rPr>
-              <w:t>330.67 kW·min</w:t>
+              <w:t>942,400.00 J</w:t>
             </w:r>
           </w:p>
         </w:tc>
@@ -711,7 +711,7 @@
               <w:rPr>
                 <w:sz w:val="17"/>
               </w:rPr>
-              <w:t>5.51 kWh</w:t>
+              <w:t>0.26178 kWh</w:t>
             </w:r>
           </w:p>
         </w:tc>
@@ -783,7 +783,7 @@
               <w:rPr>
                 <w:sz w:val="17"/>
               </w:rPr>
-              <w:t>(3h/8) · [ P₀ + 3(P₁+P₂) + 2P₃ + 3(P₄+P₅) + P₆ ]</w:t>
+              <w:t>(3h/8) · [ P₀ + 3P₁ + 3P₂ + 2P₃ + ... + P_n ]</w:t>
             </w:r>
           </w:p>
         </w:tc>
@@ -806,7 +806,7 @@
               <w:rPr>
                 <w:sz w:val="17"/>
               </w:rPr>
-              <w:t>341.48 kW·min</w:t>
+              <w:t>946,125.00 J</w:t>
             </w:r>
           </w:p>
         </w:tc>
@@ -829,7 +829,7 @@
               <w:rPr>
                 <w:sz w:val="17"/>
               </w:rPr>
-              <w:t>5.69 kWh</w:t>
+              <w:t>0.26281 kWh</w:t>
             </w:r>
           </w:p>
         </w:tc>
@@ -843,7 +843,7 @@
       <w:r>
         <w:drawing>
           <wp:inline xmlns:a="http://schemas.openxmlformats.org/drawingml/2006/main" xmlns:pic="http://schemas.openxmlformats.org/drawingml/2006/picture">
-            <wp:extent cx="4937760" cy="3170220"/>
+            <wp:extent cx="4937760" cy="3079209"/>
             <wp:docPr id="5" name="Picture 5"/>
             <wp:cNvGraphicFramePr>
               <a:graphicFrameLocks noChangeAspect="1"/>
@@ -864,7 +864,7 @@
                   <pic:spPr>
                     <a:xfrm>
                       <a:off x="0" y="0"/>
-                      <a:ext cx="4937760" cy="3170220"/>
+                      <a:ext cx="4937760" cy="3079209"/>
                     </a:xfrm>
                     <a:prstGeom prst="rect"/>
                   </pic:spPr>
@@ -887,13 +887,13 @@
         <w:br/>
       </w:r>
       <w:r>
-        <w:t>• Trapezoidal (325.20 kW·min) connects points with straight chords, cutting slightly below curved acceleration peaks.</w:t>
+        <w:t>• Trapezoidal (939,000 J) connects points with straight chords, slightly cutting beneath the peak warming phase (1800 W at t = 240s).</w:t>
         <w:br/>
-        <w:t>• Simpson 1/3 (330.67 kW·min) fits smooth parabolas across triplets of points, capturing the rounded cruise peaks much better.</w:t>
+        <w:t>• Simpson 1/3 (942,400 J) fits quadratic parabolas across triplets of points, capturing the rounded thermal rise and plateau smoothly.</w:t>
         <w:br/>
-        <w:t>• Simpson 3/8 (341.48 kW·min) uses cubic splines across groups of 4 points, capturing rapid non-linear throttle changes.</w:t>
+        <w:t>• Simpson 3/8 (946,125 J) fits cubic splines across groups of 4 points, capturing higher-order rate changes during initial heater startup.</w:t>
         <w:br/>
-        <w:t>• All three methods yield close, consistent results (~5.4 to 5.7 kWh), confirming that Simpson rules provide superior curvature tracking on real experimental telemetry.</w:t>
+        <w:t>• All three methods converge very tightly around 0.261 kWh of total cabin heating energy consumed, proving the reliability of numerical integration for battery vehicle management.</w:t>
       </w:r>
     </w:p>
     <w:sectPr>

</xml_diff>

<commit_message>
Add Assignment 7 & 8 style convergence and error graphs for each individual method
</commit_message>
<xml_diff>
--- a/Assignment_9/Assignment_9_RealTime_Dataset_Comparison.docx
+++ b/Assignment_9/Assignment_9_RealTime_Dataset_Comparison.docx
@@ -27,7 +27,7 @@
       <w:r>
         <w:rPr>
           <w:color w:val="505050"/>
-          <w:sz w:val="20"/>
+          <w:sz w:val="19"/>
         </w:rPr>
         <w:t>Date: Oct 12, 2026</w:t>
         <w:br/>
@@ -36,7 +36,7 @@
       <w:r>
         <w:rPr>
           <w:b/>
-          <w:sz w:val="22"/>
+          <w:sz w:val="21"/>
         </w:rPr>
         <w:t>Name: Kunal Kamod</w:t>
         <w:br/>
@@ -48,15 +48,23 @@
         <w:spacing w:before="160" w:after="120" w:line="276" w:lineRule="auto"/>
       </w:pPr>
       <w:r>
-        <w:t>For this assignment, I downloaded a real electric vehicle dataset from Kaggle: "Battery and Heating Data in Real Driving Cycles" (https://www.kaggle.com/datasets/atechnohazard/battery-and-heating-data-in-real-driving-cycles). The dataset contains actual road test measurements recorded from a BMW i3 (60 Ah) EV, specifically TripB01 in winter conditions.</w:t>
+        <w:t>For this assignment, I evaluated the three primary numerical integration methods (Trapezoidal Rule, Simpson's 1/3 Rule, and Simpson's 3/8 Rule) using a real electric vehicle telemetry dataset from Kaggle: "Battery and Heating Data in Real Driving Cycles" (https://www.kaggle.com/datasets/atechnohazard/battery-and-heating-data-in-real-driving-cycles).</w:t>
         <w:br/>
         <w:br/>
-        <w:t>We evaluate the cabin and battery Heating Power P(t) [W] over a 12-minute trip (t = 0 to 720 seconds, step size h = 60s, n = 12 intervals). The physical goal is to compute the total thermal energy consumed by integrating the power curve: E = ∫₀⁷²⁰ P(t) dt. Because n = 12 is both an even number and divisible by 3, all three numerical integration methods can be evaluated directly on the complete dataset.</w:t>
+        <w:t>The dataset logs cabin Heating Power P(t) [W] from a BMW i3 EV during winter driving (TripB01). We integrate over a 12-minute commute (t = 0 to 720 s, h = 60s, n = 12 intervals) to determine the total thermal energy: E = ∫ P(t) dt. Below are the raw data, individual approximation curves, Assignment 7/8 style convergence graphs across step sizes, and the final side-by-side comparison.</w:t>
       </w:r>
     </w:p>
     <w:p>
       <w:pPr>
-        <w:spacing w:before="160" w:after="40"/>
+        <w:spacing w:before="120" w:after="160"/>
+        <w:pBdr>
+          <w:bottom w:val="single" w:sz="6" w:space="1" w:color="D0D5DD"/>
+        </w:pBdr>
+      </w:pPr>
+    </w:p>
+    <w:p>
+      <w:pPr>
+        <w:spacing w:before="80" w:after="40"/>
       </w:pPr>
       <w:r>
         <w:rPr>
@@ -72,7 +80,7 @@
         <w:spacing w:before="40" w:after="80"/>
       </w:pPr>
       <w:r>
-        <w:t>First, here is a scatter plot showing all 13 sampled telemetry points of Heating Power [W] across the trip:</w:t>
+        <w:t>First, here is the scatter plot showing the 13 recorded telemetry measurements of Heating Power [W]:</w:t>
       </w:r>
     </w:p>
     <w:p>
@@ -83,7 +91,7 @@
       <w:r>
         <w:drawing>
           <wp:inline xmlns:a="http://schemas.openxmlformats.org/drawingml/2006/main" xmlns:pic="http://schemas.openxmlformats.org/drawingml/2006/picture">
-            <wp:extent cx="4937760" cy="3079209"/>
+            <wp:extent cx="4754880" cy="2965164"/>
             <wp:docPr id="1" name="Picture 1"/>
             <wp:cNvGraphicFramePr>
               <a:graphicFrameLocks noChangeAspect="1"/>
@@ -104,7 +112,7 @@
                   <pic:spPr>
                     <a:xfrm>
                       <a:off x="0" y="0"/>
-                      <a:ext cx="4937760" cy="3079209"/>
+                      <a:ext cx="4754880" cy="2965164"/>
                     </a:xfrm>
                     <a:prstGeom prst="rect"/>
                   </pic:spPr>
@@ -117,7 +125,15 @@
     </w:p>
     <w:p>
       <w:pPr>
-        <w:spacing w:before="200" w:after="40"/>
+        <w:spacing w:before="120" w:after="160"/>
+        <w:pBdr>
+          <w:bottom w:val="single" w:sz="6" w:space="1" w:color="D0D5DD"/>
+        </w:pBdr>
+      </w:pPr>
+    </w:p>
+    <w:p>
+      <w:pPr>
+        <w:spacing w:before="120" w:after="40"/>
       </w:pPr>
       <w:r>
         <w:rPr>
@@ -125,7 +141,7 @@
           <w:color w:val="1E468C"/>
           <w:sz w:val="24"/>
         </w:rPr>
-        <w:t>2. Individual Approximations by Each Method</w:t>
+        <w:t>2. Individual Results and Convergence Graphs for Each Method</w:t>
       </w:r>
     </w:p>
     <w:p>
@@ -138,26 +154,32 @@
           <w:color w:val="142850"/>
           <w:sz w:val="22"/>
         </w:rPr>
-        <w:t>Method 1: Trapezoidal Rule (Linear Chords)</w:t>
+        <w:t>Method 1: Trapezoidal Rule (Linear Approximation &amp; Convergence)</w:t>
       </w:r>
     </w:p>
     <w:p>
       <w:pPr>
-        <w:spacing w:before="40" w:after="80"/>
+        <w:spacing w:before="40" w:after="80" w:line="276" w:lineRule="auto"/>
       </w:pPr>
       <w:r>
-        <w:t>This graph shows the trapezoidal approximation connecting points with straight chords. Total computed thermal energy = 939,000.00 Joules (0.26083 kWh).</w:t>
+        <w:t>• Formula: I ≈ h · [ P₀/2 + ∑ P_i + P_n/2 ]</w:t>
+        <w:br/>
+        <w:t>• Full Result (n = 12, h = 60s): Total Energy = 939,000.00 Joules (0.26083 kWh).</w:t>
+        <w:br/>
+        <w:t>• Graph A (Geometric Chords): Displays the piecewise linear trapezoids connecting data points.</w:t>
+        <w:br/>
+        <w:t>• Graph B (Assignment 7 Style Convergence): Plots the calculated energy across n = 2, 4, 6, 12 approaching the reference value.</w:t>
       </w:r>
     </w:p>
     <w:p>
       <w:pPr>
-        <w:spacing w:before="80" w:after="120"/>
+        <w:spacing w:before="80" w:after="80"/>
         <w:jc w:val="center"/>
       </w:pPr>
       <w:r>
         <w:drawing>
           <wp:inline xmlns:a="http://schemas.openxmlformats.org/drawingml/2006/main" xmlns:pic="http://schemas.openxmlformats.org/drawingml/2006/picture">
-            <wp:extent cx="4937760" cy="3079209"/>
+            <wp:extent cx="4389120" cy="2737075"/>
             <wp:docPr id="2" name="Picture 2"/>
             <wp:cNvGraphicFramePr>
               <a:graphicFrameLocks noChangeAspect="1"/>
@@ -178,7 +200,47 @@
                   <pic:spPr>
                     <a:xfrm>
                       <a:off x="0" y="0"/>
-                      <a:ext cx="4937760" cy="3079209"/>
+                      <a:ext cx="4389120" cy="2737075"/>
+                    </a:xfrm>
+                    <a:prstGeom prst="rect"/>
+                  </pic:spPr>
+                </pic:pic>
+              </a:graphicData>
+            </a:graphic>
+          </wp:inline>
+        </w:drawing>
+      </w:r>
+    </w:p>
+    <w:p>
+      <w:pPr>
+        <w:spacing w:before="80" w:after="120"/>
+        <w:jc w:val="center"/>
+      </w:pPr>
+      <w:r>
+        <w:drawing>
+          <wp:inline xmlns:a="http://schemas.openxmlformats.org/drawingml/2006/main" xmlns:pic="http://schemas.openxmlformats.org/drawingml/2006/picture">
+            <wp:extent cx="4389120" cy="2662756"/>
+            <wp:docPr id="3" name="Picture 3"/>
+            <wp:cNvGraphicFramePr>
+              <a:graphicFrameLocks noChangeAspect="1"/>
+            </wp:cNvGraphicFramePr>
+            <a:graphic>
+              <a:graphicData uri="http://schemas.openxmlformats.org/drawingml/2006/picture">
+                <pic:pic>
+                  <pic:nvPicPr>
+                    <pic:cNvPr id="0" name="trapezoidal_convergence_graph.png"/>
+                    <pic:cNvPicPr/>
+                  </pic:nvPicPr>
+                  <pic:blipFill>
+                    <a:blip r:embed="rId12"/>
+                    <a:stretch>
+                      <a:fillRect/>
+                    </a:stretch>
+                  </pic:blipFill>
+                  <pic:spPr>
+                    <a:xfrm>
+                      <a:off x="0" y="0"/>
+                      <a:ext cx="4389120" cy="2662756"/>
                     </a:xfrm>
                     <a:prstGeom prst="rect"/>
                   </pic:spPr>
@@ -199,27 +261,33 @@
           <w:color w:val="142850"/>
           <w:sz w:val="22"/>
         </w:rPr>
-        <w:t>Method 2: Simpson's 1/3 Rule (Quadratic Parabolas)</w:t>
+        <w:t>Method 2: Simpson's 1/3 Rule (Parabolic Approximation &amp; Convergence)</w:t>
       </w:r>
     </w:p>
     <w:p>
       <w:pPr>
-        <w:spacing w:before="40" w:after="80"/>
+        <w:spacing w:before="40" w:after="80" w:line="276" w:lineRule="auto"/>
       </w:pPr>
       <w:r>
-        <w:t>This graph shows Simpson's 1/3 rule fitting parabolic arcs across triplets of points (n = 12 is even). Total computed thermal energy = 942,400.00 Joules (0.26178 kWh).</w:t>
+        <w:t>• Formula: I ≈ (h/3) · [ P₀ + 4∑ P_odd + 2∑ P_even + P_n ]</w:t>
+        <w:br/>
+        <w:t>• Full Result (n = 12 is even, h = 60s): Total Energy = 942,400.00 Joules (0.26178 kWh).</w:t>
+        <w:br/>
+        <w:t>• Graph A (Geometric Parabolas): Fits smooth degree-2 parabolas across triplets of points.</w:t>
+        <w:br/>
+        <w:t>• Graph B (Assignment 8 Style Progression): Shows rapid fourth-order convergence as even intervals increase (n = 2, 4, 6, 12).</w:t>
       </w:r>
     </w:p>
     <w:p>
       <w:pPr>
-        <w:spacing w:before="80" w:after="120"/>
+        <w:spacing w:before="80" w:after="80"/>
         <w:jc w:val="center"/>
       </w:pPr>
       <w:r>
         <w:drawing>
           <wp:inline xmlns:a="http://schemas.openxmlformats.org/drawingml/2006/main" xmlns:pic="http://schemas.openxmlformats.org/drawingml/2006/picture">
-            <wp:extent cx="4937760" cy="3079209"/>
-            <wp:docPr id="3" name="Picture 3"/>
+            <wp:extent cx="4389120" cy="2737075"/>
+            <wp:docPr id="4" name="Picture 4"/>
             <wp:cNvGraphicFramePr>
               <a:graphicFrameLocks noChangeAspect="1"/>
             </wp:cNvGraphicFramePr>
@@ -231,7 +299,7 @@
                     <pic:cNvPicPr/>
                   </pic:nvPicPr>
                   <pic:blipFill>
-                    <a:blip r:embed="rId12"/>
+                    <a:blip r:embed="rId13"/>
                     <a:stretch>
                       <a:fillRect/>
                     </a:stretch>
@@ -239,7 +307,47 @@
                   <pic:spPr>
                     <a:xfrm>
                       <a:off x="0" y="0"/>
-                      <a:ext cx="4937760" cy="3079209"/>
+                      <a:ext cx="4389120" cy="2737075"/>
+                    </a:xfrm>
+                    <a:prstGeom prst="rect"/>
+                  </pic:spPr>
+                </pic:pic>
+              </a:graphicData>
+            </a:graphic>
+          </wp:inline>
+        </w:drawing>
+      </w:r>
+    </w:p>
+    <w:p>
+      <w:pPr>
+        <w:spacing w:before="80" w:after="120"/>
+        <w:jc w:val="center"/>
+      </w:pPr>
+      <w:r>
+        <w:drawing>
+          <wp:inline xmlns:a="http://schemas.openxmlformats.org/drawingml/2006/main" xmlns:pic="http://schemas.openxmlformats.org/drawingml/2006/picture">
+            <wp:extent cx="4389120" cy="2662756"/>
+            <wp:docPr id="5" name="Picture 5"/>
+            <wp:cNvGraphicFramePr>
+              <a:graphicFrameLocks noChangeAspect="1"/>
+            </wp:cNvGraphicFramePr>
+            <a:graphic>
+              <a:graphicData uri="http://schemas.openxmlformats.org/drawingml/2006/picture">
+                <pic:pic>
+                  <pic:nvPicPr>
+                    <pic:cNvPr id="0" name="simpson13_convergence_graph.png"/>
+                    <pic:cNvPicPr/>
+                  </pic:nvPicPr>
+                  <pic:blipFill>
+                    <a:blip r:embed="rId14"/>
+                    <a:stretch>
+                      <a:fillRect/>
+                    </a:stretch>
+                  </pic:blipFill>
+                  <pic:spPr>
+                    <a:xfrm>
+                      <a:off x="0" y="0"/>
+                      <a:ext cx="4389120" cy="2662756"/>
                     </a:xfrm>
                     <a:prstGeom prst="rect"/>
                   </pic:spPr>
@@ -260,27 +368,33 @@
           <w:color w:val="142850"/>
           <w:sz w:val="22"/>
         </w:rPr>
-        <w:t>Method 3: Simpson's 3/8 Rule (Cubic Polynomials)</w:t>
+        <w:t>Method 3: Simpson's 3/8 Rule (Cubic Approximation &amp; Convergence)</w:t>
       </w:r>
     </w:p>
     <w:p>
       <w:pPr>
-        <w:spacing w:before="40" w:after="80"/>
+        <w:spacing w:before="40" w:after="80" w:line="276" w:lineRule="auto"/>
       </w:pPr>
       <w:r>
-        <w:t>This graph shows Simpson's 3/8 rule fitting degree-3 cubic curves across groups of 4 points (n = 12 is divisible by 3). Total computed thermal energy = 946,125.00 Joules (0.26281 kWh).</w:t>
+        <w:t>• Formula: I ≈ (3h/8) · [ P₀ + 3P₁ + 3P₂ + 2P₃ + ... + P_n ]</w:t>
+        <w:br/>
+        <w:t>• Full Result (n = 12 is divisible by 3, h = 60s): Total Energy = 946,125.00 Joules (0.26281 kWh).</w:t>
+        <w:br/>
+        <w:t>• Graph A (Geometric Cubics): Fits degree-3 cubic splines across groups of 4 points.</w:t>
+        <w:br/>
+        <w:t>• Graph B (Assignment 8 Style Progression): Demonstrates convergence across multiples of 3 (n = 3, 6, 12).</w:t>
       </w:r>
     </w:p>
     <w:p>
       <w:pPr>
-        <w:spacing w:before="80" w:after="120"/>
+        <w:spacing w:before="80" w:after="80"/>
         <w:jc w:val="center"/>
       </w:pPr>
       <w:r>
         <w:drawing>
           <wp:inline xmlns:a="http://schemas.openxmlformats.org/drawingml/2006/main" xmlns:pic="http://schemas.openxmlformats.org/drawingml/2006/picture">
-            <wp:extent cx="4937760" cy="3079209"/>
-            <wp:docPr id="4" name="Picture 4"/>
+            <wp:extent cx="4389120" cy="2737075"/>
+            <wp:docPr id="6" name="Picture 6"/>
             <wp:cNvGraphicFramePr>
               <a:graphicFrameLocks noChangeAspect="1"/>
             </wp:cNvGraphicFramePr>
@@ -292,7 +406,7 @@
                     <pic:cNvPicPr/>
                   </pic:nvPicPr>
                   <pic:blipFill>
-                    <a:blip r:embed="rId13"/>
+                    <a:blip r:embed="rId15"/>
                     <a:stretch>
                       <a:fillRect/>
                     </a:stretch>
@@ -300,7 +414,7 @@
                   <pic:spPr>
                     <a:xfrm>
                       <a:off x="0" y="0"/>
-                      <a:ext cx="4937760" cy="3079209"/>
+                      <a:ext cx="4389120" cy="2737075"/>
                     </a:xfrm>
                     <a:prstGeom prst="rect"/>
                   </pic:spPr>
@@ -313,7 +427,55 @@
     </w:p>
     <w:p>
       <w:pPr>
-        <w:spacing w:before="200" w:after="40"/>
+        <w:spacing w:before="80" w:after="120"/>
+        <w:jc w:val="center"/>
+      </w:pPr>
+      <w:r>
+        <w:drawing>
+          <wp:inline xmlns:a="http://schemas.openxmlformats.org/drawingml/2006/main" xmlns:pic="http://schemas.openxmlformats.org/drawingml/2006/picture">
+            <wp:extent cx="4389120" cy="2662756"/>
+            <wp:docPr id="7" name="Picture 7"/>
+            <wp:cNvGraphicFramePr>
+              <a:graphicFrameLocks noChangeAspect="1"/>
+            </wp:cNvGraphicFramePr>
+            <a:graphic>
+              <a:graphicData uri="http://schemas.openxmlformats.org/drawingml/2006/picture">
+                <pic:pic>
+                  <pic:nvPicPr>
+                    <pic:cNvPr id="0" name="simpson38_convergence_graph.png"/>
+                    <pic:cNvPicPr/>
+                  </pic:nvPicPr>
+                  <pic:blipFill>
+                    <a:blip r:embed="rId16"/>
+                    <a:stretch>
+                      <a:fillRect/>
+                    </a:stretch>
+                  </pic:blipFill>
+                  <pic:spPr>
+                    <a:xfrm>
+                      <a:off x="0" y="0"/>
+                      <a:ext cx="4389120" cy="2662756"/>
+                    </a:xfrm>
+                    <a:prstGeom prst="rect"/>
+                  </pic:spPr>
+                </pic:pic>
+              </a:graphicData>
+            </a:graphic>
+          </wp:inline>
+        </w:drawing>
+      </w:r>
+    </w:p>
+    <w:p>
+      <w:pPr>
+        <w:spacing w:before="120" w:after="160"/>
+        <w:pBdr>
+          <w:bottom w:val="single" w:sz="6" w:space="1" w:color="D0D5DD"/>
+        </w:pBdr>
+      </w:pPr>
+    </w:p>
+    <w:p>
+      <w:pPr>
+        <w:spacing w:before="120" w:after="40"/>
       </w:pPr>
       <w:r>
         <w:rPr>
@@ -329,7 +491,7 @@
         <w:spacing w:before="40" w:after="80" w:line="276" w:lineRule="auto"/>
       </w:pPr>
       <w:r>
-        <w:t>Below is the side-by-side comparison table of all three numerical integration methods on the Kaggle BMW i3 dataset:</w:t>
+        <w:t>Below is the complete side-by-side comparison table of all three numerical methods on the Kaggle BMW i3 dataset:</w:t>
       </w:r>
     </w:p>
     <w:tbl>
@@ -486,8 +648,8 @@
             <w:tcW w:type="dxa" w:w="1872"/>
             <w:shd w:fill="F9FAFB"/>
             <w:tcMar>
-              <w:top w:w="60" w:type="dxa"/>
-              <w:bottom w:w="60" w:type="dxa"/>
+              <w:top w:w="50" w:type="dxa"/>
+              <w:bottom w:w="50" w:type="dxa"/>
               <w:left w:w="90" w:type="dxa"/>
               <w:right w:w="90" w:type="dxa"/>
             </w:tcMar>
@@ -510,8 +672,8 @@
             <w:tcW w:type="dxa" w:w="1872"/>
             <w:shd w:fill="F9FAFB"/>
             <w:tcMar>
-              <w:top w:w="60" w:type="dxa"/>
-              <w:bottom w:w="60" w:type="dxa"/>
+              <w:top w:w="50" w:type="dxa"/>
+              <w:bottom w:w="50" w:type="dxa"/>
               <w:left w:w="90" w:type="dxa"/>
               <w:right w:w="90" w:type="dxa"/>
             </w:tcMar>
@@ -533,8 +695,8 @@
             <w:tcW w:type="dxa" w:w="1872"/>
             <w:shd w:fill="F9FAFB"/>
             <w:tcMar>
-              <w:top w:w="60" w:type="dxa"/>
-              <w:bottom w:w="60" w:type="dxa"/>
+              <w:top w:w="50" w:type="dxa"/>
+              <w:bottom w:w="50" w:type="dxa"/>
               <w:left w:w="90" w:type="dxa"/>
               <w:right w:w="90" w:type="dxa"/>
             </w:tcMar>
@@ -556,8 +718,8 @@
             <w:tcW w:type="dxa" w:w="1872"/>
             <w:shd w:fill="F9FAFB"/>
             <w:tcMar>
-              <w:top w:w="60" w:type="dxa"/>
-              <w:bottom w:w="60" w:type="dxa"/>
+              <w:top w:w="50" w:type="dxa"/>
+              <w:bottom w:w="50" w:type="dxa"/>
               <w:left w:w="90" w:type="dxa"/>
               <w:right w:w="90" w:type="dxa"/>
             </w:tcMar>
@@ -579,8 +741,8 @@
             <w:tcW w:type="dxa" w:w="1872"/>
             <w:shd w:fill="F9FAFB"/>
             <w:tcMar>
-              <w:top w:w="60" w:type="dxa"/>
-              <w:bottom w:w="60" w:type="dxa"/>
+              <w:top w:w="50" w:type="dxa"/>
+              <w:bottom w:w="50" w:type="dxa"/>
               <w:left w:w="90" w:type="dxa"/>
               <w:right w:w="90" w:type="dxa"/>
             </w:tcMar>
@@ -604,8 +766,8 @@
             <w:tcW w:type="dxa" w:w="1872"/>
             <w:shd w:fill="FFFFFF"/>
             <w:tcMar>
-              <w:top w:w="60" w:type="dxa"/>
-              <w:bottom w:w="60" w:type="dxa"/>
+              <w:top w:w="50" w:type="dxa"/>
+              <w:bottom w:w="50" w:type="dxa"/>
               <w:left w:w="90" w:type="dxa"/>
               <w:right w:w="90" w:type="dxa"/>
             </w:tcMar>
@@ -628,8 +790,8 @@
             <w:tcW w:type="dxa" w:w="1872"/>
             <w:shd w:fill="FFFFFF"/>
             <w:tcMar>
-              <w:top w:w="60" w:type="dxa"/>
-              <w:bottom w:w="60" w:type="dxa"/>
+              <w:top w:w="50" w:type="dxa"/>
+              <w:bottom w:w="50" w:type="dxa"/>
               <w:left w:w="90" w:type="dxa"/>
               <w:right w:w="90" w:type="dxa"/>
             </w:tcMar>
@@ -651,8 +813,8 @@
             <w:tcW w:type="dxa" w:w="1872"/>
             <w:shd w:fill="FFFFFF"/>
             <w:tcMar>
-              <w:top w:w="60" w:type="dxa"/>
-              <w:bottom w:w="60" w:type="dxa"/>
+              <w:top w:w="50" w:type="dxa"/>
+              <w:bottom w:w="50" w:type="dxa"/>
               <w:left w:w="90" w:type="dxa"/>
               <w:right w:w="90" w:type="dxa"/>
             </w:tcMar>
@@ -674,8 +836,8 @@
             <w:tcW w:type="dxa" w:w="1872"/>
             <w:shd w:fill="FFFFFF"/>
             <w:tcMar>
-              <w:top w:w="60" w:type="dxa"/>
-              <w:bottom w:w="60" w:type="dxa"/>
+              <w:top w:w="50" w:type="dxa"/>
+              <w:bottom w:w="50" w:type="dxa"/>
               <w:left w:w="90" w:type="dxa"/>
               <w:right w:w="90" w:type="dxa"/>
             </w:tcMar>
@@ -697,8 +859,8 @@
             <w:tcW w:type="dxa" w:w="1872"/>
             <w:shd w:fill="FFFFFF"/>
             <w:tcMar>
-              <w:top w:w="60" w:type="dxa"/>
-              <w:bottom w:w="60" w:type="dxa"/>
+              <w:top w:w="50" w:type="dxa"/>
+              <w:bottom w:w="50" w:type="dxa"/>
               <w:left w:w="90" w:type="dxa"/>
               <w:right w:w="90" w:type="dxa"/>
             </w:tcMar>
@@ -722,8 +884,8 @@
             <w:tcW w:type="dxa" w:w="1872"/>
             <w:shd w:fill="F9FAFB"/>
             <w:tcMar>
-              <w:top w:w="60" w:type="dxa"/>
-              <w:bottom w:w="60" w:type="dxa"/>
+              <w:top w:w="50" w:type="dxa"/>
+              <w:bottom w:w="50" w:type="dxa"/>
               <w:left w:w="90" w:type="dxa"/>
               <w:right w:w="90" w:type="dxa"/>
             </w:tcMar>
@@ -746,8 +908,8 @@
             <w:tcW w:type="dxa" w:w="1872"/>
             <w:shd w:fill="F9FAFB"/>
             <w:tcMar>
-              <w:top w:w="60" w:type="dxa"/>
-              <w:bottom w:w="60" w:type="dxa"/>
+              <w:top w:w="50" w:type="dxa"/>
+              <w:bottom w:w="50" w:type="dxa"/>
               <w:left w:w="90" w:type="dxa"/>
               <w:right w:w="90" w:type="dxa"/>
             </w:tcMar>
@@ -769,8 +931,8 @@
             <w:tcW w:type="dxa" w:w="1872"/>
             <w:shd w:fill="F9FAFB"/>
             <w:tcMar>
-              <w:top w:w="60" w:type="dxa"/>
-              <w:bottom w:w="60" w:type="dxa"/>
+              <w:top w:w="50" w:type="dxa"/>
+              <w:bottom w:w="50" w:type="dxa"/>
               <w:left w:w="90" w:type="dxa"/>
               <w:right w:w="90" w:type="dxa"/>
             </w:tcMar>
@@ -792,8 +954,8 @@
             <w:tcW w:type="dxa" w:w="1872"/>
             <w:shd w:fill="F9FAFB"/>
             <w:tcMar>
-              <w:top w:w="60" w:type="dxa"/>
-              <w:bottom w:w="60" w:type="dxa"/>
+              <w:top w:w="50" w:type="dxa"/>
+              <w:bottom w:w="50" w:type="dxa"/>
               <w:left w:w="90" w:type="dxa"/>
               <w:right w:w="90" w:type="dxa"/>
             </w:tcMar>
@@ -815,8 +977,8 @@
             <w:tcW w:type="dxa" w:w="1872"/>
             <w:shd w:fill="F9FAFB"/>
             <w:tcMar>
-              <w:top w:w="60" w:type="dxa"/>
-              <w:bottom w:w="60" w:type="dxa"/>
+              <w:top w:w="50" w:type="dxa"/>
+              <w:bottom w:w="50" w:type="dxa"/>
               <w:left w:w="90" w:type="dxa"/>
               <w:right w:w="90" w:type="dxa"/>
             </w:tcMar>
@@ -837,14 +999,14 @@
     </w:tbl>
     <w:p>
       <w:pPr>
-        <w:spacing w:before="120" w:after="120"/>
+        <w:spacing w:before="120" w:after="80"/>
         <w:jc w:val="center"/>
       </w:pPr>
       <w:r>
         <w:drawing>
           <wp:inline xmlns:a="http://schemas.openxmlformats.org/drawingml/2006/main" xmlns:pic="http://schemas.openxmlformats.org/drawingml/2006/picture">
-            <wp:extent cx="4937760" cy="3079209"/>
-            <wp:docPr id="5" name="Picture 5"/>
+            <wp:extent cx="4754880" cy="2965164"/>
+            <wp:docPr id="8" name="Picture 8"/>
             <wp:cNvGraphicFramePr>
               <a:graphicFrameLocks noChangeAspect="1"/>
             </wp:cNvGraphicFramePr>
@@ -856,7 +1018,7 @@
                     <pic:cNvPicPr/>
                   </pic:nvPicPr>
                   <pic:blipFill>
-                    <a:blip r:embed="rId14"/>
+                    <a:blip r:embed="rId17"/>
                     <a:stretch>
                       <a:fillRect/>
                     </a:stretch>
@@ -864,7 +1026,7 @@
                   <pic:spPr>
                     <a:xfrm>
                       <a:off x="0" y="0"/>
-                      <a:ext cx="4937760" cy="3079209"/>
+                      <a:ext cx="4754880" cy="2965164"/>
                     </a:xfrm>
                     <a:prstGeom prst="rect"/>
                   </pic:spPr>
@@ -877,7 +1039,7 @@
     </w:p>
     <w:p>
       <w:pPr>
-        <w:spacing w:before="120" w:after="120" w:line="276" w:lineRule="auto"/>
+        <w:spacing w:before="80" w:after="120" w:line="276" w:lineRule="auto"/>
       </w:pPr>
       <w:r>
         <w:rPr>
@@ -1292,7 +1454,7 @@
     <w:rPr>
       <w:rFonts w:ascii="Calibri" w:hAnsi="Calibri"/>
       <w:color w:val="1E1E1E"/>
-      <w:sz w:val="22"/>
+      <w:sz w:val="21"/>
     </w:rPr>
   </w:style>
   <w:style w:type="paragraph" w:styleId="Header">

</xml_diff>